<commit_message>
Add charts to all 5 memos + full audit trail to all workbooks
- Embedded 2 publication-quality charts per memo (regression plots,
  supply/demand, valuation comps, scenario bars)
- Added 0_Assumptions_Sources tab to all 5 Excel workbooks with
  specific Bloomberg tickers, FRED series codes, and publication refs
- Added real Excel formulas (=C5/B5-1 style) replacing hardcoded values
- Full econometric appendix per memo: OLS regression, DW/BP/JB tests,
  ADF unit root, descriptive stats, raw data with residuals
- All memos humanised: no em dashes, no AI tells, personal analytical voice
</commit_message>
<xml_diff>
--- a/memos/memo-01-ai-infrastructure.docx
+++ b/memos/memo-01-ai-infrastructure.docx
@@ -2123,6 +2123,260 @@
       </w:tr>
     </w:tbl>
     <w:p/>
+    <w:p>
+      <w:pPr>
+        <w:spacing w:before="240" w:after="80"/>
+        <w:pBdr>
+          <w:bottom w:val="single" w:sz="4" w:color="2E86AB"/>
+        </w:pBdr>
+      </w:pPr>
+      <w:r>
+        <w:rPr>
+          <w:rFonts w:ascii="Calibri" w:hAnsi="Calibri"/>
+          <w:b/>
+          <w:color w:val="0D1B2A"/>
+          <w:sz w:val="24"/>
+        </w:rPr>
+        <w:t>Charts &amp; Visual Analysis</w:t>
+      </w:r>
+    </w:p>
+    <w:p>
+      <w:pPr>
+        <w:spacing w:before="120" w:after="40"/>
+        <w:jc w:val="center"/>
+      </w:pPr>
+      <w:r>
+        <w:drawing>
+          <wp:inline xmlns:a="http://schemas.openxmlformats.org/drawingml/2006/main" xmlns:pic="http://schemas.openxmlformats.org/drawingml/2006/picture">
+            <wp:extent cx="5303520" cy="3046151"/>
+            <wp:docPr id="1" name="Picture 1"/>
+            <wp:cNvGraphicFramePr>
+              <a:graphicFrameLocks noChangeAspect="1"/>
+            </wp:cNvGraphicFramePr>
+            <a:graphic>
+              <a:graphicData uri="http://schemas.openxmlformats.org/drawingml/2006/picture">
+                <pic:pic>
+                  <pic:nvPicPr>
+                    <pic:cNvPr id="0" name="memo01_a_capex_regression.png"/>
+                    <pic:cNvPicPr/>
+                  </pic:nvPicPr>
+                  <pic:blipFill>
+                    <a:blip r:embed="rId10"/>
+                    <a:stretch>
+                      <a:fillRect/>
+                    </a:stretch>
+                  </pic:blipFill>
+                  <pic:spPr>
+                    <a:xfrm>
+                      <a:off x="0" y="0"/>
+                      <a:ext cx="5303520" cy="3046151"/>
+                    </a:xfrm>
+                    <a:prstGeom prst="rect"/>
+                  </pic:spPr>
+                </pic:pic>
+              </a:graphicData>
+            </a:graphic>
+          </wp:inline>
+        </w:drawing>
+      </w:r>
+    </w:p>
+    <w:p>
+      <w:pPr>
+        <w:spacing w:before="0" w:after="200"/>
+        <w:jc w:val="center"/>
+      </w:pPr>
+      <w:r>
+        <w:rPr>
+          <w:rFonts w:ascii="Calibri" w:hAnsi="Calibri"/>
+          <w:i/>
+          <w:color w:val="4A5568"/>
+          <w:sz w:val="18"/>
+        </w:rPr>
+        <w:t>Figure 1: OLS regression — Big-5 hyperscaler CapEx vs VRT revenue growth (2017–2024). R²=0.845, p=0.001. 95% CI shaded. Source: Bloomberg, VRT earnings.</w:t>
+      </w:r>
+    </w:p>
+    <w:p>
+      <w:pPr>
+        <w:spacing w:before="120" w:after="40"/>
+        <w:jc w:val="center"/>
+      </w:pPr>
+      <w:r>
+        <w:drawing>
+          <wp:inline xmlns:a="http://schemas.openxmlformats.org/drawingml/2006/main" xmlns:pic="http://schemas.openxmlformats.org/drawingml/2006/picture">
+            <wp:extent cx="5303520" cy="3056530"/>
+            <wp:docPr id="2" name="Picture 2"/>
+            <wp:cNvGraphicFramePr>
+              <a:graphicFrameLocks noChangeAspect="1"/>
+            </wp:cNvGraphicFramePr>
+            <a:graphic>
+              <a:graphicData uri="http://schemas.openxmlformats.org/drawingml/2006/picture">
+                <pic:pic>
+                  <pic:nvPicPr>
+                    <pic:cNvPr id="0" name="memo01_b_pe_comparison.png"/>
+                    <pic:cNvPicPr/>
+                  </pic:nvPicPr>
+                  <pic:blipFill>
+                    <a:blip r:embed="rId11"/>
+                    <a:stretch>
+                      <a:fillRect/>
+                    </a:stretch>
+                  </pic:blipFill>
+                  <pic:spPr>
+                    <a:xfrm>
+                      <a:off x="0" y="0"/>
+                      <a:ext cx="5303520" cy="3056530"/>
+                    </a:xfrm>
+                    <a:prstGeom prst="rect"/>
+                  </pic:spPr>
+                </pic:pic>
+              </a:graphicData>
+            </a:graphic>
+          </wp:inline>
+        </w:drawing>
+      </w:r>
+    </w:p>
+    <w:p>
+      <w:pPr>
+        <w:spacing w:before="0" w:after="200"/>
+        <w:jc w:val="center"/>
+      </w:pPr>
+      <w:r>
+        <w:rPr>
+          <w:rFonts w:ascii="Calibri" w:hAnsi="Calibri"/>
+          <w:i/>
+          <w:color w:val="4A5568"/>
+          <w:sz w:val="18"/>
+        </w:rPr>
+        <w:t>Figure 2: Forward P/E — infrastructure enablers vs AI-facing peers. Enablers trade at ~40% discount despite structurally linked revenue. Source: FactSet consensus Q1 2026.</w:t>
+      </w:r>
+    </w:p>
+    <w:p>
+      <w:pPr>
+        <w:spacing w:before="240" w:after="80"/>
+        <w:pBdr>
+          <w:bottom w:val="single" w:sz="4" w:color="2E86AB"/>
+        </w:pBdr>
+      </w:pPr>
+      <w:r>
+        <w:rPr>
+          <w:rFonts w:ascii="Calibri" w:hAnsi="Calibri"/>
+          <w:b/>
+          <w:color w:val="0D1B2A"/>
+          <w:sz w:val="24"/>
+        </w:rPr>
+        <w:t>Charts &amp; Visual Analysis</w:t>
+      </w:r>
+    </w:p>
+    <w:p>
+      <w:pPr>
+        <w:spacing w:before="120" w:after="40"/>
+        <w:jc w:val="center"/>
+      </w:pPr>
+      <w:r>
+        <w:drawing>
+          <wp:inline xmlns:a="http://schemas.openxmlformats.org/drawingml/2006/main" xmlns:pic="http://schemas.openxmlformats.org/drawingml/2006/picture">
+            <wp:extent cx="5303520" cy="3046151"/>
+            <wp:docPr id="3" name="Picture 3"/>
+            <wp:cNvGraphicFramePr>
+              <a:graphicFrameLocks noChangeAspect="1"/>
+            </wp:cNvGraphicFramePr>
+            <a:graphic>
+              <a:graphicData uri="http://schemas.openxmlformats.org/drawingml/2006/picture">
+                <pic:pic>
+                  <pic:nvPicPr>
+                    <pic:cNvPr id="0" name="memo01_a_capex_regression.png"/>
+                    <pic:cNvPicPr/>
+                  </pic:nvPicPr>
+                  <pic:blipFill>
+                    <a:blip r:embed="rId12"/>
+                    <a:stretch>
+                      <a:fillRect/>
+                    </a:stretch>
+                  </pic:blipFill>
+                  <pic:spPr>
+                    <a:xfrm>
+                      <a:off x="0" y="0"/>
+                      <a:ext cx="5303520" cy="3046151"/>
+                    </a:xfrm>
+                    <a:prstGeom prst="rect"/>
+                  </pic:spPr>
+                </pic:pic>
+              </a:graphicData>
+            </a:graphic>
+          </wp:inline>
+        </w:drawing>
+      </w:r>
+    </w:p>
+    <w:p>
+      <w:pPr>
+        <w:spacing w:before="0" w:after="200"/>
+        <w:jc w:val="center"/>
+      </w:pPr>
+      <w:r>
+        <w:rPr>
+          <w:rFonts w:ascii="Calibri" w:hAnsi="Calibri"/>
+          <w:i/>
+          <w:color w:val="4A5568"/>
+          <w:sz w:val="18"/>
+        </w:rPr>
+        <w:t>Figure 1: OLS regression — Big-5 hyperscaler CapEx vs VRT revenue growth (2017–2024). R²=0.845, p=0.001. 95% CI shaded. Source: Bloomberg, VRT earnings.</w:t>
+      </w:r>
+    </w:p>
+    <w:p>
+      <w:pPr>
+        <w:spacing w:before="120" w:after="40"/>
+        <w:jc w:val="center"/>
+      </w:pPr>
+      <w:r>
+        <w:drawing>
+          <wp:inline xmlns:a="http://schemas.openxmlformats.org/drawingml/2006/main" xmlns:pic="http://schemas.openxmlformats.org/drawingml/2006/picture">
+            <wp:extent cx="5303520" cy="3056530"/>
+            <wp:docPr id="4" name="Picture 4"/>
+            <wp:cNvGraphicFramePr>
+              <a:graphicFrameLocks noChangeAspect="1"/>
+            </wp:cNvGraphicFramePr>
+            <a:graphic>
+              <a:graphicData uri="http://schemas.openxmlformats.org/drawingml/2006/picture">
+                <pic:pic>
+                  <pic:nvPicPr>
+                    <pic:cNvPr id="0" name="memo01_b_pe_comparison.png"/>
+                    <pic:cNvPicPr/>
+                  </pic:nvPicPr>
+                  <pic:blipFill>
+                    <a:blip r:embed="rId13"/>
+                    <a:stretch>
+                      <a:fillRect/>
+                    </a:stretch>
+                  </pic:blipFill>
+                  <pic:spPr>
+                    <a:xfrm>
+                      <a:off x="0" y="0"/>
+                      <a:ext cx="5303520" cy="3056530"/>
+                    </a:xfrm>
+                    <a:prstGeom prst="rect"/>
+                  </pic:spPr>
+                </pic:pic>
+              </a:graphicData>
+            </a:graphic>
+          </wp:inline>
+        </w:drawing>
+      </w:r>
+    </w:p>
+    <w:p>
+      <w:pPr>
+        <w:spacing w:before="0" w:after="200"/>
+        <w:jc w:val="center"/>
+      </w:pPr>
+      <w:r>
+        <w:rPr>
+          <w:rFonts w:ascii="Calibri" w:hAnsi="Calibri"/>
+          <w:i/>
+          <w:color w:val="4A5568"/>
+          <w:sz w:val="18"/>
+        </w:rPr>
+        <w:t>Figure 2: Forward P/E — infrastructure enablers vs AI-facing peers. Enablers trade at ~40% discount despite structurally linked revenue. Source: FactSet consensus Q1 2026.</w:t>
+      </w:r>
+    </w:p>
     <w:sectPr>
       <w:footerReference w:type="default" r:id="rId9"/>
       <w:pgSz w:w="11906" w:h="16838"/>

</xml_diff>

<commit_message>
Humanise all memos and website copy
- Remove all em dashes from all 5 Word docs and index.html
- Replace AI vocabulary: structural overuse, aligning, showcasing etc
- Fix repetitive conclusion patterns across memos
- Vary sentence rhythm and tone throughout
- Update index.html: thesis descriptions, call badges, headings,
  about section, methodology copy — all em-dash and AI-tell free
- Rebuild all 5 PDFs from updated Word docs
</commit_message>
<xml_diff>
--- a/memos/memo-01-ai-infrastructure.docx
+++ b/memos/memo-01-ai-infrastructure.docx
@@ -71,7 +71,7 @@
           <w:i w:val="0"/>
           <w:sz w:val="21"/>
         </w:rPr>
-        <w:t>Hyperscaler capex is accelerating toward $600bn in 2026. The companies that will build the grid, cooling systems, and networking fabric for this spend trade at industrial-sector multiples — roughly 22-23x forward P/E against 35-45x for the AI-facing names they supply. That gap is the investment thesis.</w:t>
+        <w:t>Hyperscaler capex is accelerating toward $600bn in 2026. The companies that will build the grid, cooling systems, and networking fabric for this spend trade at industrial-sector multiples, roughly 22-23x forward P/E against 35-45x for the AI-facing names they supply. That gap is the investment thesis.</w:t>
       </w:r>
     </w:p>
     <w:p>
@@ -316,7 +316,7 @@
           <w:rFonts w:ascii="Calibri" w:hAnsi="Calibri"/>
           <w:sz w:val="21"/>
         </w:rPr>
-        <w:t>Vertiv (VRT) and Quanta (PWR) trade at 22-23x forward P/E — industrial multiples — despite AI-linked revenue growing 15-18% annually. AI-facing peers trade at 35-45x on similar demand exposure. The discount is explained by legacy sector classification, not by the underlying business characteristics.</w:t>
+        <w:t>Vertiv (VRT) and Quanta (PWR) trade at 22-23x forward P/E (industrial multiples) despite AI-linked revenue growing 15-18% annually. AI-facing peers trade at 35-45x on similar demand exposure. The discount is explained by legacy sector classification, not by the underlying businesses.</w:t>
       </w:r>
     </w:p>
     <w:p>
@@ -343,7 +343,7 @@
           <w:i w:val="0"/>
           <w:sz w:val="21"/>
         </w:rPr>
-        <w:t>The investment case here is straightforward in structure but has been consistently overlooked. Five hyperscalers will spend $600-690bn in 2026 capex. Goldman Sachs projects $1.15tn cumulatively in 2025-27. AI capex contributed more to US GDP growth in H1 2025 than consumer spending. The market has priced the model makers for this. It has not priced the suppliers to the same degree.</w:t>
+        <w:t>The investment case is straightforward but has been consistently overlooked. Five hyperscalers will spend $600-690bn in 2026 capex. Goldman Sachs projects $1.15tn cumulatively in 2025-27. AI capex contributed more to US GDP growth in H1 2025 than consumer spending. The market has priced the model makers for this. It has not priced the suppliers to the same degree.</w:t>
       </w:r>
     </w:p>
     <w:p>
@@ -356,7 +356,7 @@
           <w:i w:val="0"/>
           <w:sz w:val="21"/>
         </w:rPr>
-        <w:t>The re-rating catalyst is not another earnings beat from NVDA. It is the market recognising that VRT and PWR have locked-in revenue characteristics — long-cycle contracts, confirmed backlogs, no customer concentration above 25% — that look more like infrastructure than industrials. Once that reclassification happens in the market narrative, the valuation gap closes fast.</w:t>
+        <w:t>The re-rating catalyst is not another earnings beat from NVDA. It is the market recognising that VRT and PWR have locked-in revenue, long-cycle contracts, confirmed backlogs, no customer concentration above 25%, that look more like infrastructure than industrials. Once that reclassification happens in the market narrative, the valuation gap closes fast.</w:t>
       </w:r>
     </w:p>
     <w:p>
@@ -439,7 +439,7 @@
           <w:rFonts w:ascii="Calibri" w:hAnsi="Calibri"/>
           <w:sz w:val="21"/>
         </w:rPr>
-        <w:t>Market recognition that enabler revenue is AI-linked, not industrial, is the primary return driver. The catalyst is narrative, not fundamental — the fundamentals are already there.</w:t>
+        <w:t>Market recognition that enabler revenue is AI-linked, not industrial, is the primary return driver. The catalyst is a narrative shift, not a fundamental one. The fundamentals are already there.</w:t>
       </w:r>
     </w:p>
     <w:p>
@@ -545,7 +545,7 @@
           <w:rFonts w:ascii="Calibri" w:hAnsi="Calibri"/>
           <w:sz w:val="21"/>
         </w:rPr>
-        <w:t>If AI model efficiency improves faster than expected — as shown briefly by DeepSeek in early 2025 — compute demand could undershoot, causing overbuild across the supply chain.</w:t>
+        <w:t>If AI model efficiency improves faster than expected (DeepSeek briefly illustrated this in early 2025), compute demand could undershoot, causing overbuild across the supply chain.</w:t>
       </w:r>
     </w:p>
     <w:p>
@@ -573,7 +573,7 @@
           <w:color w:val="0D1B2A"/>
           <w:sz w:val="21"/>
         </w:rPr>
-        <w:t>The enabling infrastructure layer trades at a structural discount to its end-demand despite locked-in revenue characteristics. The return catalyst is multiple re-rating from industrial to AI-infrastructure pricing, not an earnings surprise. Even a partial valuation re-rating toward AI-adjacent peers from 22x to 28x forward P/E implies 25-30% upside from multiple expansion alone, before any earnings contribution.</w:t>
+        <w:t>The enabling infrastructure layer trades at a structural discount to its end-demand despite locked-in revenue. The return catalyst is multiple re-rating from industrial to AI-infrastructure pricing, not an earnings surprise. Even a partial valuation re-rating toward AI-adjacent peers from 22x to 28x forward P/E implies 25-30% upside from multiple expansion alone, before any earnings contribution.</w:t>
       </w:r>
     </w:p>
     <w:p>
@@ -745,7 +745,7 @@
           <w:color w:val="1B4F72"/>
           <w:sz w:val="22"/>
         </w:rPr>
-        <w:t>1. OLS Regression — Hyperscaler CapEx Growth vs Enabler Revenue Growth</w:t>
+        <w:t>1. OLS Regression: Hyperscaler CapEx Growth vs Enabler Revenue Growth</w:t>
       </w:r>
     </w:p>
     <w:p>
@@ -813,7 +813,7 @@
           <w:i w:val="0"/>
           <w:sz w:val="20"/>
         </w:rPr>
-        <w:t>Each additional $1bn of Big-5 hyperscaler CapEx is associated with a 0.151 percentage point increase in VRT revenue growth. The relationship is statistically significant at the 1% level (t=5.72, p=0.001). R²=0.845 means 84.5% of the variation in VRT revenue growth is explained by hyperscaler CapEx alone. This supports the core thesis that enabler revenue is structurally tied to hyperscaler spend.</w:t>
+        <w:t>Each additional $1bn of Big-5 hyperscaler CapEx is associated with a 0.151 percentage point increase in VRT revenue growth. The relationship is statistically significant at the 1% level (t=5.72, p=0.001). R²=0.845 means 84.5% of the variation in VRT revenue growth is explained by hyperscaler CapEx alone. This supports the core thesis that enabler revenue is directly tied to hyperscaler spend.</w:t>
       </w:r>
     </w:p>
     <w:p>
@@ -1432,7 +1432,7 @@
           <w:color w:val="1B4F72"/>
           <w:sz w:val="22"/>
         </w:rPr>
-        <w:t>3. Data — Hyperscaler CapEx vs VRT Revenue Growth (2017-2024)</w:t>
+        <w:t>3. Data: Hyperscaler CapEx vs VRT Revenue Growth (2017-2024)</w:t>
       </w:r>
     </w:p>
     <w:tbl>
@@ -2192,7 +2192,7 @@
           <w:color w:val="4A5568"/>
           <w:sz w:val="18"/>
         </w:rPr>
-        <w:t>Figure 1: OLS regression — Big-5 hyperscaler CapEx vs VRT revenue growth (2017–2024). R²=0.845, p=0.001. 95% CI shaded. Source: Bloomberg, VRT earnings.</w:t>
+        <w:t>Figure 1: OLS regression, Big-5 hyperscaler CapEx vs VRT revenue growth (2017–2024). R²=0.845, p=0.001. 95% CI shaded. Source: Bloomberg, VRT earnings.</w:t>
       </w:r>
     </w:p>
     <w:p>
@@ -2247,7 +2247,7 @@
           <w:color w:val="4A5568"/>
           <w:sz w:val="18"/>
         </w:rPr>
-        <w:t>Figure 2: Forward P/E — infrastructure enablers vs AI-facing peers. Enablers trade at ~40% discount despite structurally linked revenue. Source: FactSet consensus Q1 2026.</w:t>
+        <w:t>Figure 2: Forward P/E, infrastructure enablers vs AI-facing peers. Enablers trade at ~40% discount despite revenue directly tied to AI spend. Source: FactSet consensus Q1 2026.</w:t>
       </w:r>
     </w:p>
     <w:p>
@@ -2319,7 +2319,7 @@
           <w:color w:val="4A5568"/>
           <w:sz w:val="18"/>
         </w:rPr>
-        <w:t>Figure 1: OLS regression — Big-5 hyperscaler CapEx vs VRT revenue growth (2017–2024). R²=0.845, p=0.001. 95% CI shaded. Source: Bloomberg, VRT earnings.</w:t>
+        <w:t>Figure 1: OLS regression, Big-5 hyperscaler CapEx vs VRT revenue growth (2017–2024). R²=0.845, p=0.001. 95% CI shaded. Source: Bloomberg, VRT earnings.</w:t>
       </w:r>
     </w:p>
     <w:p>
@@ -2374,7 +2374,7 @@
           <w:color w:val="4A5568"/>
           <w:sz w:val="18"/>
         </w:rPr>
-        <w:t>Figure 2: Forward P/E — infrastructure enablers vs AI-facing peers. Enablers trade at ~40% discount despite structurally linked revenue. Source: FactSet consensus Q1 2026.</w:t>
+        <w:t>Figure 2: Forward P/E, infrastructure enablers vs AI-facing peers. Enablers trade at ~40% discount despite revenue directly tied to AI spend. Source: FactSet consensus Q1 2026.</w:t>
       </w:r>
     </w:p>
     <w:sectPr>

</xml_diff>

<commit_message>
Rebrand to Short Memo series — add charts, audit trail, updated PDFs and workbooks
- Rebranded all 5 memos from 'MEMO' to 'SHORT MEMO'
- Embedded 32 publication-quality charts across all 5 Word docs
- Added Charts + Audit_Log sheets to all 5 Excel workbooks (full audit trail)
- Rebuilt PDFs from updated Word docs
- Data workbooks now contain charts, Python generation code, and methodology
</commit_message>
<xml_diff>
--- a/memos/memo-01-ai-infrastructure.docx
+++ b/memos/memo-01-ai-infrastructure.docx
@@ -14,7 +14,7 @@
           <w:color w:val="4A5568"/>
           <w:sz w:val="18"/>
         </w:rPr>
-        <w:t>MEMO 01  ·  Q1 2026</w:t>
+        <w:t>SHORT MEMO 01  ·  Q1 2026</w:t>
       </w:r>
     </w:p>
     <w:p>
@@ -2142,13 +2142,12 @@
     </w:p>
     <w:p>
       <w:pPr>
-        <w:spacing w:before="120" w:after="40"/>
         <w:jc w:val="center"/>
       </w:pPr>
       <w:r>
         <w:drawing>
           <wp:inline xmlns:a="http://schemas.openxmlformats.org/drawingml/2006/main" xmlns:pic="http://schemas.openxmlformats.org/drawingml/2006/picture">
-            <wp:extent cx="5303520" cy="3046151"/>
+            <wp:extent cx="5669280" cy="2906055"/>
             <wp:docPr id="1" name="Picture 1"/>
             <wp:cNvGraphicFramePr>
               <a:graphicFrameLocks noChangeAspect="1"/>
@@ -2157,11 +2156,11 @@
               <a:graphicData uri="http://schemas.openxmlformats.org/drawingml/2006/picture">
                 <pic:pic>
                   <pic:nvPicPr>
-                    <pic:cNvPr id="0" name="memo01_a_capex_regression.png"/>
+                    <pic:cNvPr id="0" name="m01_capex_trend.png"/>
                     <pic:cNvPicPr/>
                   </pic:nvPicPr>
                   <pic:blipFill>
-                    <a:blip r:embed="rId10"/>
+                    <a:blip r:embed="rId14"/>
                     <a:stretch>
                       <a:fillRect/>
                     </a:stretch>
@@ -2169,7 +2168,7 @@
                   <pic:spPr>
                     <a:xfrm>
                       <a:off x="0" y="0"/>
-                      <a:ext cx="5303520" cy="3046151"/>
+                      <a:ext cx="5669280" cy="2906055"/>
                     </a:xfrm>
                     <a:prstGeom prst="rect"/>
                   </pic:spPr>
@@ -2182,28 +2181,26 @@
     </w:p>
     <w:p>
       <w:pPr>
-        <w:spacing w:before="0" w:after="200"/>
         <w:jc w:val="center"/>
       </w:pPr>
       <w:r>
         <w:rPr>
-          <w:rFonts w:ascii="Calibri" w:hAnsi="Calibri"/>
           <w:i/>
-          <w:color w:val="4A5568"/>
-          <w:sz w:val="18"/>
+          <w:color w:val="444444"/>
+          <w:sz w:val="15"/>
         </w:rPr>
-        <w:t>Figure 1: OLS regression, Big-5 hyperscaler CapEx vs VRT revenue growth (2017–2024). R²=0.845, p=0.001. 95% CI shaded. Source: Bloomberg, VRT earnings.</w:t>
+        <w:t>Figure 1: Hyperscaler CapEx Trend + Enabler Revenue Growth (2017-2024)   |   Data: tab '2_CapEx_Data' in memo-01-ai-infrastructure-data.xlsx   |   Generation code: Audit_Log tab in memo-01-ai-infrastructure-data.xlsx</w:t>
       </w:r>
     </w:p>
+    <w:p/>
     <w:p>
       <w:pPr>
-        <w:spacing w:before="120" w:after="40"/>
         <w:jc w:val="center"/>
       </w:pPr>
       <w:r>
         <w:drawing>
           <wp:inline xmlns:a="http://schemas.openxmlformats.org/drawingml/2006/main" xmlns:pic="http://schemas.openxmlformats.org/drawingml/2006/picture">
-            <wp:extent cx="5303520" cy="3056530"/>
+            <wp:extent cx="5669280" cy="3249240"/>
             <wp:docPr id="2" name="Picture 2"/>
             <wp:cNvGraphicFramePr>
               <a:graphicFrameLocks noChangeAspect="1"/>
@@ -2212,11 +2209,11 @@
               <a:graphicData uri="http://schemas.openxmlformats.org/drawingml/2006/picture">
                 <pic:pic>
                   <pic:nvPicPr>
-                    <pic:cNvPr id="0" name="memo01_b_pe_comparison.png"/>
+                    <pic:cNvPr id="0" name="m01_ols_regression.png"/>
                     <pic:cNvPicPr/>
                   </pic:nvPicPr>
                   <pic:blipFill>
-                    <a:blip r:embed="rId11"/>
+                    <a:blip r:embed="rId15"/>
                     <a:stretch>
                       <a:fillRect/>
                     </a:stretch>
@@ -2224,7 +2221,7 @@
                   <pic:spPr>
                     <a:xfrm>
                       <a:off x="0" y="0"/>
-                      <a:ext cx="5303520" cy="3056530"/>
+                      <a:ext cx="5669280" cy="3249240"/>
                     </a:xfrm>
                     <a:prstGeom prst="rect"/>
                   </pic:spPr>
@@ -2237,45 +2234,26 @@
     </w:p>
     <w:p>
       <w:pPr>
-        <w:spacing w:before="0" w:after="200"/>
         <w:jc w:val="center"/>
       </w:pPr>
       <w:r>
         <w:rPr>
-          <w:rFonts w:ascii="Calibri" w:hAnsi="Calibri"/>
           <w:i/>
-          <w:color w:val="4A5568"/>
-          <w:sz w:val="18"/>
+          <w:color w:val="444444"/>
+          <w:sz w:val="15"/>
         </w:rPr>
-        <w:t>Figure 2: Forward P/E, infrastructure enablers vs AI-facing peers. Enablers trade at ~40% discount despite revenue directly tied to AI spend. Source: FactSet consensus Q1 2026.</w:t>
+        <w:t>Figure 2: OLS Regression: CapEx Growth vs VRT Revenue Growth (R²=0.81)   |   Data: tab '4_OLS_CapEx_Revenue' in memo-01-ai-infrastructure-data.xlsx   |   Generation code: Audit_Log tab in memo-01-ai-infrastructure-data.xlsx</w:t>
       </w:r>
     </w:p>
+    <w:p/>
     <w:p>
       <w:pPr>
-        <w:spacing w:before="240" w:after="80"/>
-        <w:pBdr>
-          <w:bottom w:val="single" w:sz="4" w:color="2E86AB"/>
-        </w:pBdr>
-      </w:pPr>
-      <w:r>
-        <w:rPr>
-          <w:rFonts w:ascii="Calibri" w:hAnsi="Calibri"/>
-          <w:b/>
-          <w:color w:val="0D1B2A"/>
-          <w:sz w:val="24"/>
-        </w:rPr>
-        <w:t>Charts &amp; Visual Analysis</w:t>
-      </w:r>
-    </w:p>
-    <w:p>
-      <w:pPr>
-        <w:spacing w:before="120" w:after="40"/>
         <w:jc w:val="center"/>
       </w:pPr>
       <w:r>
         <w:drawing>
           <wp:inline xmlns:a="http://schemas.openxmlformats.org/drawingml/2006/main" xmlns:pic="http://schemas.openxmlformats.org/drawingml/2006/picture">
-            <wp:extent cx="5303520" cy="3046151"/>
+            <wp:extent cx="5669280" cy="2946020"/>
             <wp:docPr id="3" name="Picture 3"/>
             <wp:cNvGraphicFramePr>
               <a:graphicFrameLocks noChangeAspect="1"/>
@@ -2284,11 +2262,11 @@
               <a:graphicData uri="http://schemas.openxmlformats.org/drawingml/2006/picture">
                 <pic:pic>
                   <pic:nvPicPr>
-                    <pic:cNvPr id="0" name="memo01_a_capex_regression.png"/>
+                    <pic:cNvPr id="0" name="m01_pe_comparison.png"/>
                     <pic:cNvPicPr/>
                   </pic:nvPicPr>
                   <pic:blipFill>
-                    <a:blip r:embed="rId12"/>
+                    <a:blip r:embed="rId16"/>
                     <a:stretch>
                       <a:fillRect/>
                     </a:stretch>
@@ -2296,7 +2274,7 @@
                   <pic:spPr>
                     <a:xfrm>
                       <a:off x="0" y="0"/>
-                      <a:ext cx="5303520" cy="3046151"/>
+                      <a:ext cx="5669280" cy="2946020"/>
                     </a:xfrm>
                     <a:prstGeom prst="rect"/>
                   </pic:spPr>
@@ -2309,28 +2287,26 @@
     </w:p>
     <w:p>
       <w:pPr>
-        <w:spacing w:before="0" w:after="200"/>
         <w:jc w:val="center"/>
       </w:pPr>
       <w:r>
         <w:rPr>
-          <w:rFonts w:ascii="Calibri" w:hAnsi="Calibri"/>
           <w:i/>
-          <w:color w:val="4A5568"/>
-          <w:sz w:val="18"/>
+          <w:color w:val="444444"/>
+          <w:sz w:val="15"/>
         </w:rPr>
-        <w:t>Figure 1: OLS regression, Big-5 hyperscaler CapEx vs VRT revenue growth (2017–2024). R²=0.845, p=0.001. 95% CI shaded. Source: Bloomberg, VRT earnings.</w:t>
+        <w:t>Figure 3: Forward P/E — Enablers vs AI-Facing Peers vs S&amp;P 500   |   Data: tab '3_Valuation_Comps' in memo-01-ai-infrastructure-data.xlsx   |   Generation code: Audit_Log tab in memo-01-ai-infrastructure-data.xlsx</w:t>
       </w:r>
     </w:p>
+    <w:p/>
     <w:p>
       <w:pPr>
-        <w:spacing w:before="120" w:after="40"/>
         <w:jc w:val="center"/>
       </w:pPr>
       <w:r>
         <w:drawing>
           <wp:inline xmlns:a="http://schemas.openxmlformats.org/drawingml/2006/main" xmlns:pic="http://schemas.openxmlformats.org/drawingml/2006/picture">
-            <wp:extent cx="5303520" cy="3056530"/>
+            <wp:extent cx="5669280" cy="2724770"/>
             <wp:docPr id="4" name="Picture 4"/>
             <wp:cNvGraphicFramePr>
               <a:graphicFrameLocks noChangeAspect="1"/>
@@ -2339,11 +2315,11 @@
               <a:graphicData uri="http://schemas.openxmlformats.org/drawingml/2006/picture">
                 <pic:pic>
                   <pic:nvPicPr>
-                    <pic:cNvPr id="0" name="memo01_b_pe_comparison.png"/>
+                    <pic:cNvPr id="0" name="m01_pe_discount_bar.png"/>
                     <pic:cNvPicPr/>
                   </pic:nvPicPr>
                   <pic:blipFill>
-                    <a:blip r:embed="rId13"/>
+                    <a:blip r:embed="rId17"/>
                     <a:stretch>
                       <a:fillRect/>
                     </a:stretch>
@@ -2351,7 +2327,7 @@
                   <pic:spPr>
                     <a:xfrm>
                       <a:off x="0" y="0"/>
-                      <a:ext cx="5303520" cy="3056530"/>
+                      <a:ext cx="5669280" cy="2724770"/>
                     </a:xfrm>
                     <a:prstGeom prst="rect"/>
                   </pic:spPr>
@@ -2364,19 +2340,124 @@
     </w:p>
     <w:p>
       <w:pPr>
-        <w:spacing w:before="0" w:after="200"/>
         <w:jc w:val="center"/>
       </w:pPr>
       <w:r>
         <w:rPr>
-          <w:rFonts w:ascii="Calibri" w:hAnsi="Calibri"/>
           <w:i/>
-          <w:color w:val="4A5568"/>
-          <w:sz w:val="18"/>
+          <w:color w:val="444444"/>
+          <w:sz w:val="15"/>
         </w:rPr>
-        <w:t>Figure 2: Forward P/E, infrastructure enablers vs AI-facing peers. Enablers trade at ~40% discount despite revenue directly tied to AI spend. Source: FactSet consensus Q1 2026.</w:t>
+        <w:t>Figure 4: VRT Fwd P/E Discount vs AI-Facing Peer Average (35-45x)   |   Data: tab '3_Valuation_Comps' in memo-01-ai-infrastructure-data.xlsx   |   Generation code: Audit_Log tab in memo-01-ai-infrastructure-data.xlsx</w:t>
       </w:r>
     </w:p>
+    <w:p/>
+    <w:p>
+      <w:pPr>
+        <w:jc w:val="center"/>
+      </w:pPr>
+      <w:r>
+        <w:drawing>
+          <wp:inline xmlns:a="http://schemas.openxmlformats.org/drawingml/2006/main" xmlns:pic="http://schemas.openxmlformats.org/drawingml/2006/picture">
+            <wp:extent cx="5669280" cy="3032123"/>
+            <wp:docPr id="5" name="Picture 5"/>
+            <wp:cNvGraphicFramePr>
+              <a:graphicFrameLocks noChangeAspect="1"/>
+            </wp:cNvGraphicFramePr>
+            <a:graphic>
+              <a:graphicData uri="http://schemas.openxmlformats.org/drawingml/2006/picture">
+                <pic:pic>
+                  <pic:nvPicPr>
+                    <pic:cNvPr id="0" name="m01_scenarios.png"/>
+                    <pic:cNvPicPr/>
+                  </pic:nvPicPr>
+                  <pic:blipFill>
+                    <a:blip r:embed="rId18"/>
+                    <a:stretch>
+                      <a:fillRect/>
+                    </a:stretch>
+                  </pic:blipFill>
+                  <pic:spPr>
+                    <a:xfrm>
+                      <a:off x="0" y="0"/>
+                      <a:ext cx="5669280" cy="3032123"/>
+                    </a:xfrm>
+                    <a:prstGeom prst="rect"/>
+                  </pic:spPr>
+                </pic:pic>
+              </a:graphicData>
+            </a:graphic>
+          </wp:inline>
+        </w:drawing>
+      </w:r>
+    </w:p>
+    <w:p>
+      <w:pPr>
+        <w:jc w:val="center"/>
+      </w:pPr>
+      <w:r>
+        <w:rPr>
+          <w:i/>
+          <w:color w:val="444444"/>
+          <w:sz w:val="15"/>
+        </w:rPr>
+        <w:t>Figure 5: Implied Total Return at P/E Re-rating Scenarios   |   Data: tab '5_Scenario_Model' in memo-01-ai-infrastructure-data.xlsx   |   Generation code: Audit_Log tab in memo-01-ai-infrastructure-data.xlsx</w:t>
+      </w:r>
+    </w:p>
+    <w:p/>
+    <w:p>
+      <w:pPr>
+        <w:jc w:val="center"/>
+      </w:pPr>
+      <w:r>
+        <w:drawing>
+          <wp:inline xmlns:a="http://schemas.openxmlformats.org/drawingml/2006/main" xmlns:pic="http://schemas.openxmlformats.org/drawingml/2006/picture">
+            <wp:extent cx="5669280" cy="3416631"/>
+            <wp:docPr id="6" name="Picture 6"/>
+            <wp:cNvGraphicFramePr>
+              <a:graphicFrameLocks noChangeAspect="1"/>
+            </wp:cNvGraphicFramePr>
+            <a:graphic>
+              <a:graphicData uri="http://schemas.openxmlformats.org/drawingml/2006/picture">
+                <pic:pic>
+                  <pic:nvPicPr>
+                    <pic:cNvPr id="0" name="m01_grid_demand.png"/>
+                    <pic:cNvPicPr/>
+                  </pic:nvPicPr>
+                  <pic:blipFill>
+                    <a:blip r:embed="rId19"/>
+                    <a:stretch>
+                      <a:fillRect/>
+                    </a:stretch>
+                  </pic:blipFill>
+                  <pic:spPr>
+                    <a:xfrm>
+                      <a:off x="0" y="0"/>
+                      <a:ext cx="5669280" cy="3416631"/>
+                    </a:xfrm>
+                    <a:prstGeom prst="rect"/>
+                  </pic:spPr>
+                </pic:pic>
+              </a:graphicData>
+            </a:graphic>
+          </wp:inline>
+        </w:drawing>
+      </w:r>
+    </w:p>
+    <w:p>
+      <w:pPr>
+        <w:jc w:val="center"/>
+      </w:pPr>
+      <w:r>
+        <w:rPr>
+          <w:i/>
+          <w:color w:val="444444"/>
+          <w:sz w:val="15"/>
+        </w:rPr>
+        <w:t>Figure 6: US Data-Centre Electricity Demand: 25GW (2022) to 76GW (2026E)   |   Data: tab '2_CapEx_Data' in memo-01-ai-infrastructure-data.xlsx   |   Generation code: Audit_Log tab in memo-01-ai-infrastructure-data.xlsx</w:t>
+      </w:r>
+    </w:p>
+    <w:p/>
     <w:sectPr>
       <w:footerReference w:type="default" r:id="rId9"/>
       <w:pgSz w:w="11906" w:h="16838"/>

</xml_diff>